<commit_message>
Cross-report coherence audit: correct ring mass and centrifugal figures
- TRPT_Conical_Stack_Analysis: update M_RING_REF from 0.4 → 0.684 kg/ring
  (= 9.57 kg / 14 rings, authoritative from ring scalability FoS=3 analysis).
  Single-rotor baseline corrected from 523 → 426 W/kg; 3-rotor conical
  corrected from 676 → 540 W/kg (+27% gain preserved). Wind shear context
  note updated.

- TRPT_Stacked_Rotor_Analysis: corrected corrigendum note added; centrifugal
  force figures corrected (r_cm 3.0 → 3.8 m, F_centrifugal 2685 → 3402 N,
  per-blade 537 → 680 N, net hub tension 1908 → 2625 N, factor 3.5 → 4.4).
  Annular blade geometry documented in §2.2. Wind shear corrigendum added.

- TRPT_Ring_Scalability_Report: annular blade geometry note added to §4
  mass budget section (r_hub = 2.0 m, R = 5.0 m, span = 3.0 m, 11 kg total).

Co-Authored-By: Claude Sonnet 4.6 <noreply@anthropic.com>
</commit_message>
<xml_diff>
--- a/TRPT_Conical_Stack_Analysis.docx
+++ b/TRPT_Conical_Stack_Analysis.docx
@@ -94,7 +94,7 @@
         <w:spacing w:after="120" w:before="0"/>
       </w:pPr>
       <w:r>
-        <w:t>Correcting for both effects reverses the stacking trend completely. The 3-rotor system with conical expansion reaches P/W = 676 W/kg — 29% above the single-rotor baseline of 523 W/kg — and delivers 44.2 kW total power from 65.4 kg of airborne mass. This is summarised in Table 1 and detailed in the sections that follow.</w:t>
+        <w:t>Correcting for both effects reverses the stacking trend completely. The 3-rotor system with conical expansion reaches P/W = 540 W/kg — 27% above the single-rotor baseline of 426 W/kg — and delivers 44.2 kW total power from 81.9 kg of airborne mass. This is summarised in Table 1 and detailed in the sections that follow.</w:t>
       </w:r>
     </w:p>
     <w:p>
@@ -263,7 +263,7 @@
               <w:rPr>
                 <w:sz w:val="18"/>
               </w:rPr>
-              <w:t>17.5</w:t>
+              <w:t>21.5</w:t>
             </w:r>
           </w:p>
         </w:tc>
@@ -280,7 +280,7 @@
               <w:rPr>
                 <w:sz w:val="18"/>
               </w:rPr>
-              <w:t>523</w:t>
+              <w:t>426</w:t>
             </w:r>
           </w:p>
         </w:tc>
@@ -347,7 +347,7 @@
               <w:rPr>
                 <w:sz w:val="18"/>
               </w:rPr>
-              <w:t>37.3</w:t>
+              <w:t>46.9</w:t>
             </w:r>
           </w:p>
         </w:tc>
@@ -363,7 +363,7 @@
               <w:rPr>
                 <w:sz w:val="18"/>
               </w:rPr>
-              <w:t>490</w:t>
+              <w:t>390</w:t>
             </w:r>
           </w:p>
         </w:tc>
@@ -379,7 +379,7 @@
               <w:rPr>
                 <w:sz w:val="18"/>
               </w:rPr>
-              <w:t>−6.3%</w:t>
+              <w:t>−8.5%</w:t>
             </w:r>
           </w:p>
         </w:tc>
@@ -432,7 +432,7 @@
               <w:rPr>
                 <w:sz w:val="18"/>
               </w:rPr>
-              <w:t>58.9</w:t>
+              <w:t>75.4</w:t>
             </w:r>
           </w:p>
         </w:tc>
@@ -449,7 +449,7 @@
               <w:rPr>
                 <w:sz w:val="18"/>
               </w:rPr>
-              <w:t>466</w:t>
+              <w:t>364</w:t>
             </w:r>
           </w:p>
         </w:tc>
@@ -466,7 +466,7 @@
               <w:rPr>
                 <w:sz w:val="18"/>
               </w:rPr>
-              <w:t>−10.9%</w:t>
+              <w:t>−14.6%</w:t>
             </w:r>
           </w:p>
         </w:tc>
@@ -516,7 +516,7 @@
               <w:rPr>
                 <w:sz w:val="18"/>
               </w:rPr>
-              <w:t>37.3</w:t>
+              <w:t>46.9</w:t>
             </w:r>
           </w:p>
         </w:tc>
@@ -532,7 +532,7 @@
               <w:rPr>
                 <w:sz w:val="18"/>
               </w:rPr>
-              <w:t>575</w:t>
+              <w:t>457</w:t>
             </w:r>
           </w:p>
         </w:tc>
@@ -548,7 +548,7 @@
               <w:rPr>
                 <w:sz w:val="18"/>
               </w:rPr>
-              <w:t>+10.0%</w:t>
+              <w:t>+7.3%</w:t>
             </w:r>
           </w:p>
         </w:tc>
@@ -601,7 +601,7 @@
               <w:rPr>
                 <w:sz w:val="18"/>
               </w:rPr>
-              <w:t>58.9</w:t>
+              <w:t>75.4</w:t>
             </w:r>
           </w:p>
         </w:tc>
@@ -618,7 +618,7 @@
               <w:rPr>
                 <w:sz w:val="18"/>
               </w:rPr>
-              <w:t>613</w:t>
+              <w:t>479</w:t>
             </w:r>
           </w:p>
         </w:tc>
@@ -635,7 +635,7 @@
               <w:rPr>
                 <w:sz w:val="18"/>
               </w:rPr>
-              <w:t>+17.2%</w:t>
+              <w:t>+12.4%</w:t>
             </w:r>
           </w:p>
         </w:tc>
@@ -685,7 +685,7 @@
               <w:rPr>
                 <w:sz w:val="18"/>
               </w:rPr>
-              <w:t>39.7</w:t>
+              <w:t>49.3</w:t>
             </w:r>
           </w:p>
         </w:tc>
@@ -701,7 +701,7 @@
               <w:rPr>
                 <w:sz w:val="18"/>
               </w:rPr>
-              <w:t>608</w:t>
+              <w:t>490</w:t>
             </w:r>
           </w:p>
         </w:tc>
@@ -717,7 +717,7 @@
               <w:rPr>
                 <w:sz w:val="18"/>
               </w:rPr>
-              <w:t>+16.3%</w:t>
+              <w:t>+15.0%</w:t>
             </w:r>
           </w:p>
         </w:tc>
@@ -770,7 +770,7 @@
               <w:rPr>
                 <w:sz w:val="18"/>
               </w:rPr>
-              <w:t>65.4</w:t>
+              <w:t>81.9</w:t>
             </w:r>
           </w:p>
         </w:tc>
@@ -787,7 +787,7 @@
               <w:rPr>
                 <w:sz w:val="18"/>
               </w:rPr>
-              <w:t>676</w:t>
+              <w:t>540</w:t>
             </w:r>
           </w:p>
         </w:tc>
@@ -804,7 +804,7 @@
               <w:rPr>
                 <w:sz w:val="18"/>
               </w:rPr>
-              <w:t>+29.3%</w:t>
+              <w:t>+26.8%</w:t>
             </w:r>
           </w:p>
         </w:tc>
@@ -1453,7 +1453,7 @@
         <w:spacing w:after="120" w:before="0"/>
       </w:pPr>
       <w:r>
-        <w:t>Note: the previous stacked rotor analysis (TRPT_Stacked_Rotor_Analysis.docx) used a fixed v = 11 m/s for all rotors regardless of altitude, underestimating the 3-rotor P/W by approximately 29%.</w:t>
+        <w:t>Note: the previous stacked rotor analysis (TRPT_Stacked_Rotor_Analysis.docx) used a fixed v = 11 m/s for all rotors regardless of altitude. With corrected ring mass (0.684 kg/ring from TRPT_Ring_Scalability_Report), the single-rotor baseline is 426 W/kg; the 3-rotor system with wind shear reaches 479 W/kg (+12%) and with full conical expansion reaches 540 W/kg (+27%).</w:t>
       </w:r>
     </w:p>
     <w:p>
@@ -1717,7 +1717,7 @@
         <w:spacing w:after="120" w:before="0"/>
       </w:pPr>
       <w:r>
-        <w:t>The baseline scenario shows the structural mass penalty correctly: each additional rotor adds approximately 20 kg of structure (rings + tethers at increased torque) but only 9.1 kW of power at the same wind speed, so P/W degrades from 523 to 466 W/kg. Once wind shear is accounted for, rotor 2 generates 12.3 kW and rotor 3 generates 14.6 kW — both significantly above the 9.1 kW baseline — and the 3-rotor system reaches 613 W/kg. Adding TSR-matched expansion pushes these figures to 15.0 kW and 20.1 kW respectively, yielding 676 W/kg for the 3-rotor conical configuration.</w:t>
+        <w:t>The baseline scenario shows the structural mass penalty correctly: each additional rotor adds approximately 25–28 kg of structure (rings + tethers at increased torque) but only 9.1 kW of power at the same wind speed, so P/W degrades from 426 to 364 W/kg. Once wind shear is accounted for, rotor 2 generates 12.3 kW and rotor 3 generates 14.6 kW — both significantly above the 9.1 kW baseline — and the 3-rotor system reaches 479 W/kg. Adding TSR-matched expansion pushes these figures to 15.0 kW and 20.1 kW respectively, yielding 540 W/kg for the 3-rotor conical configuration.</w:t>
       </w:r>
     </w:p>
     <w:p>
@@ -2674,7 +2674,7 @@
         <w:spacing w:after="120" w:before="0"/>
       </w:pPr>
       <w:r>
-        <w:t>The 3-rotor conical configuration (R = 5.0, 5.52, 5.85 m) delivers 44.2 kW at 676 W/kg from a 65 kg system. This is a compelling case for a 45 kW-class prototype. The radial compliance required for TSR-matched expansion (+10–17%) is modest and may be achievable passively through careful hub ring stiffness tuning, avoiding any active radius control mechanism.</w:t>
+        <w:t>The 3-rotor conical configuration (R = 5.0, 5.52, 5.85 m) delivers 44.2 kW at 540 W/kg from an 82 kg system. This is a compelling case for a 45 kW-class prototype. The radial compliance required for TSR-matched expansion (+10–17%) is modest and may be achievable passively through careful hub ring stiffness tuning, avoiding any active radius control mechanism.</w:t>
       </w:r>
     </w:p>
     <w:p>
@@ -2767,7 +2767,7 @@
         <w:ind w:left="360"/>
       </w:pPr>
       <w:r>
-        <w:t>Previous stacked analysis underestimated P/W by ~29% by omitting wind shear. Wind shear alone makes stacking beneficial (613 W/kg for 3 rotors vs 523 W/kg single).</w:t>
+        <w:t>Previous stacked analysis underestimated P/W by omitting wind shear. Wind shear alone makes stacking beneficial (479 W/kg for 3 rotors vs 426 W/kg single — +12%).</w:t>
       </w:r>
     </w:p>
     <w:p>
@@ -2776,7 +2776,7 @@
         <w:ind w:left="360"/>
       </w:pPr>
       <w:r>
-        <w:t>TSR-matched centrifugal expansion adds a further 10% P/W gain on top of wind shear. The 3-rotor conical configuration reaches 676 W/kg and 44.2 kW total power.</w:t>
+        <w:t>TSR-matched centrifugal expansion adds a further ~13% P/W gain on top of wind shear. The 3-rotor conical configuration reaches 540 W/kg and 44.2 kW total power.</w:t>
       </w:r>
     </w:p>
     <w:p>

</xml_diff>